<commit_message>
fix(quick-report): wire defects pipeline & align VI summary template
- Wire MasterQr03DefectRepository to fetch CBM & VI defects in composer
- Fix Word COM Range collapse handling to prevent RPC crashes on paste
- Fix substation condition template variables (header_left/header_right)
- Refactor summary & defect pages to native DocxTemplate Jinja rendering
- Align VI summary template properties (centering, widths, 0.4in height)
- Bump version to 1.5.1
</commit_message>
<xml_diff>
--- a/templates/QUICK REPORT/2. VI SUMMARY TEMPLATE Jinja2 DYNAMIC.docx
+++ b/templates/QUICK REPORT/2. VI SUMMARY TEMPLATE Jinja2 DYNAMIC.docx
@@ -23,26 +23,27 @@
     <w:tbl>
       <w:tblPr>
         <w:tblStyle w:val="TableGrid"/>
-        <w:tblW w:w="10710" w:type="dxa"/>
-        <w:tblInd w:w="-702" w:type="dxa"/>
         <w:tblLook w:val="04A0" w:firstRow="1" w:lastRow="0" w:firstColumn="1" w:lastColumn="0" w:noHBand="0" w:noVBand="1"/>
+        <w:tblW w:w="0" w:type="auto"/>
+        <w:jc w:val="center"/>
+        <w:tblLayout w:type="fixed"/>
       </w:tblPr>
       <w:tblGrid>
-        <w:gridCol w:w="887"/>
-        <w:gridCol w:w="3320"/>
-        <w:gridCol w:w="3320"/>
-        <w:gridCol w:w="3183"/>
+        <w:gridCol w:w="720"/>
+        <w:gridCol w:w="3240"/>
+        <w:gridCol w:w="3240"/>
+        <w:gridCol w:w="3240"/>
       </w:tblGrid>
       <w:tr>
         <w:trPr>
-          <w:trHeight w:val="677"/>
           <w:tblHeader/>
+          <w:trHeight w:val="576" w:hRule="atLeast"/>
         </w:trPr>
         <w:tc>
           <w:tcPr>
-            <w:tcW w:w="887" w:type="dxa"/>
             <w:shd w:val="clear" w:color="auto" w:fill="D9D9D9"/>
             <w:vAlign w:val="center"/>
+            <w:tcW w:w="720" w:type="dxa"/>
           </w:tcPr>
           <w:p>
             <w:pPr>
@@ -58,11 +59,9 @@
             </w:pPr>
             <w:r>
               <w:rPr>
-                <w:rFonts w:ascii="Tahoma" w:hAnsi="Tahoma" w:cs="Tahoma"/>
+                <w:rFonts w:ascii="Tahoma" w:hAnsi="Tahoma"/>
+                <w:b/>
                 <w:sz w:val="20"/>
-                <w:szCs w:val="20"/>
-                <w:b/>
-                <w:bCs/>
               </w:rPr>
               <w:t>NO.</w:t>
             </w:r>
@@ -70,9 +69,9 @@
         </w:tc>
         <w:tc>
           <w:tcPr>
-            <w:tcW w:w="3320" w:type="dxa"/>
             <w:shd w:val="clear" w:color="auto" w:fill="D9D9D9"/>
             <w:vAlign w:val="center"/>
+            <w:tcW w:w="3240" w:type="dxa"/>
           </w:tcPr>
           <w:p>
             <w:pPr>
@@ -88,11 +87,9 @@
             </w:pPr>
             <w:r>
               <w:rPr>
-                <w:rFonts w:ascii="Tahoma" w:hAnsi="Tahoma" w:cs="Tahoma"/>
+                <w:rFonts w:ascii="Tahoma" w:hAnsi="Tahoma"/>
+                <w:b/>
                 <w:sz w:val="20"/>
-                <w:szCs w:val="20"/>
-                <w:b/>
-                <w:bCs/>
               </w:rPr>
               <w:t>EQUIPMENT</w:t>
             </w:r>
@@ -100,9 +97,9 @@
         </w:tc>
         <w:tc>
           <w:tcPr>
-            <w:tcW w:w="3320" w:type="dxa"/>
             <w:shd w:val="clear" w:color="auto" w:fill="D9D9D9"/>
             <w:vAlign w:val="center"/>
+            <w:tcW w:w="3240" w:type="dxa"/>
           </w:tcPr>
           <w:p>
             <w:pPr>
@@ -118,11 +115,9 @@
             </w:pPr>
             <w:r>
               <w:rPr>
-                <w:rFonts w:ascii="Tahoma" w:hAnsi="Tahoma" w:cs="Tahoma"/>
+                <w:rFonts w:ascii="Tahoma" w:hAnsi="Tahoma"/>
+                <w:b/>
                 <w:sz w:val="20"/>
-                <w:szCs w:val="20"/>
-                <w:b/>
-                <w:bCs/>
               </w:rPr>
               <w:t>DEFECT DESCRIPTION</w:t>
             </w:r>
@@ -130,9 +125,9 @@
         </w:tc>
         <w:tc>
           <w:tcPr>
-            <w:tcW w:w="3183" w:type="dxa"/>
             <w:shd w:val="clear" w:color="auto" w:fill="D9D9D9"/>
             <w:vAlign w:val="center"/>
+            <w:tcW w:w="3240" w:type="dxa"/>
           </w:tcPr>
           <w:p>
             <w:pPr>
@@ -148,22 +143,23 @@
             </w:pPr>
             <w:r>
               <w:rPr>
-                <w:rFonts w:ascii="Tahoma" w:hAnsi="Tahoma" w:cs="Tahoma"/>
+                <w:rFonts w:ascii="Tahoma" w:hAnsi="Tahoma"/>
+                <w:b/>
                 <w:sz w:val="20"/>
-                <w:szCs w:val="20"/>
-                <w:b/>
-                <w:bCs/>
               </w:rPr>
-              <w:t>REMARKS</w:t>
+              <w:t>ADDITIONAL REMARKS</w:t>
             </w:r>
           </w:p>
         </w:tc>
       </w:tr>
       <w:tr>
+        <w:trPr>
+          <w:trHeight w:val="576" w:hRule="atLeast"/>
+        </w:trPr>
         <w:tc>
           <w:tcPr>
-            <w:tcW w:w="887" w:type="dxa"/>
             <w:vAlign w:val="center"/>
+            <w:tcW w:w="720" w:type="dxa"/>
           </w:tcPr>
           <w:p>
             <w:pPr>
@@ -187,8 +183,8 @@
         </w:tc>
         <w:tc>
           <w:tcPr>
-            <w:tcW w:w="3320" w:type="dxa"/>
             <w:vAlign w:val="center"/>
+            <w:tcW w:w="3240" w:type="dxa"/>
           </w:tcPr>
           <w:p>
             <w:pPr>
@@ -211,8 +207,8 @@
         </w:tc>
         <w:tc>
           <w:tcPr>
-            <w:tcW w:w="3320" w:type="dxa"/>
             <w:vAlign w:val="center"/>
+            <w:tcW w:w="3240" w:type="dxa"/>
           </w:tcPr>
           <w:p>
             <w:pPr>
@@ -235,8 +231,8 @@
         </w:tc>
         <w:tc>
           <w:tcPr>
-            <w:tcW w:w="3183" w:type="dxa"/>
             <w:vAlign w:val="center"/>
+            <w:tcW w:w="3240" w:type="dxa"/>
           </w:tcPr>
           <w:p>
             <w:pPr>
@@ -259,10 +255,13 @@
         </w:tc>
       </w:tr>
       <w:tr>
+        <w:trPr>
+          <w:trHeight w:val="576" w:hRule="atLeast"/>
+        </w:trPr>
         <w:tc>
           <w:tcPr>
-            <w:tcW w:type="dxa" w:w="887"/>
             <w:vAlign w:val="center"/>
+            <w:tcW w:w="720" w:type="dxa"/>
           </w:tcPr>
           <w:p>
             <w:pPr>
@@ -276,9 +275,9 @@
             </w:pPr>
             <w:r>
               <w:rPr>
-                <w:rFonts w:ascii="Tahoma" w:hAnsi="Tahoma" w:cs="Tahoma"/>
+                <w:rFonts w:ascii="Tahoma" w:hAnsi="Tahoma"/>
+                <w:b w:val="0"/>
                 <w:sz w:val="20"/>
-                <w:szCs w:val="20"/>
               </w:rPr>
               <w:t>{{ loop.index }}</w:t>
             </w:r>
@@ -286,8 +285,8 @@
         </w:tc>
         <w:tc>
           <w:tcPr>
-            <w:tcW w:type="dxa" w:w="3320"/>
             <w:vAlign w:val="center"/>
+            <w:tcW w:w="3240" w:type="dxa"/>
           </w:tcPr>
           <w:p>
             <w:pPr>
@@ -301,9 +300,9 @@
             </w:pPr>
             <w:r>
               <w:rPr>
-                <w:rFonts w:ascii="Tahoma" w:hAnsi="Tahoma" w:cs="Tahoma"/>
+                <w:rFonts w:ascii="Tahoma" w:hAnsi="Tahoma"/>
+                <w:b w:val="0"/>
                 <w:sz w:val="20"/>
-                <w:szCs w:val="20"/>
               </w:rPr>
               <w:t>{{ item.equipment }}</w:t>
             </w:r>
@@ -311,8 +310,8 @@
         </w:tc>
         <w:tc>
           <w:tcPr>
-            <w:tcW w:type="dxa" w:w="3320"/>
             <w:vAlign w:val="center"/>
+            <w:tcW w:w="3240" w:type="dxa"/>
           </w:tcPr>
           <w:p>
             <w:pPr>
@@ -326,9 +325,9 @@
             </w:pPr>
             <w:r>
               <w:rPr>
-                <w:rFonts w:ascii="Tahoma" w:hAnsi="Tahoma" w:cs="Tahoma"/>
+                <w:rFonts w:ascii="Tahoma" w:hAnsi="Tahoma"/>
+                <w:b w:val="0"/>
                 <w:sz w:val="20"/>
-                <w:szCs w:val="20"/>
               </w:rPr>
               <w:t>{{ item.defect_area }}</w:t>
             </w:r>
@@ -336,8 +335,8 @@
         </w:tc>
         <w:tc>
           <w:tcPr>
-            <w:tcW w:type="dxa" w:w="3183"/>
             <w:vAlign w:val="center"/>
+            <w:tcW w:w="3240" w:type="dxa"/>
           </w:tcPr>
           <w:p>
             <w:pPr>
@@ -351,9 +350,9 @@
             </w:pPr>
             <w:r>
               <w:rPr>
-                <w:rFonts w:ascii="Tahoma" w:hAnsi="Tahoma" w:cs="Tahoma"/>
+                <w:rFonts w:ascii="Tahoma" w:hAnsi="Tahoma"/>
+                <w:b w:val="0"/>
                 <w:sz w:val="20"/>
-                <w:szCs w:val="20"/>
               </w:rPr>
               <w:t>{{ item.remarks }}</w:t>
             </w:r>
@@ -361,10 +360,13 @@
         </w:tc>
       </w:tr>
       <w:tr>
+        <w:trPr>
+          <w:trHeight w:val="576" w:hRule="atLeast"/>
+        </w:trPr>
         <w:tc>
           <w:tcPr>
-            <w:tcW w:type="dxa" w:w="887"/>
             <w:vAlign w:val="center"/>
+            <w:tcW w:w="720" w:type="dxa"/>
           </w:tcPr>
           <w:p>
             <w:pPr>
@@ -388,8 +390,8 @@
         </w:tc>
         <w:tc>
           <w:tcPr>
-            <w:tcW w:type="dxa" w:w="3320"/>
             <w:vAlign w:val="center"/>
+            <w:tcW w:w="3240" w:type="dxa"/>
           </w:tcPr>
           <w:p>
             <w:pPr>
@@ -412,8 +414,8 @@
         </w:tc>
         <w:tc>
           <w:tcPr>
-            <w:tcW w:type="dxa" w:w="3320"/>
             <w:vAlign w:val="center"/>
+            <w:tcW w:w="3240" w:type="dxa"/>
           </w:tcPr>
           <w:p>
             <w:pPr>
@@ -436,8 +438,8 @@
         </w:tc>
         <w:tc>
           <w:tcPr>
-            <w:tcW w:type="dxa" w:w="3183"/>
             <w:vAlign w:val="center"/>
+            <w:tcW w:w="3240" w:type="dxa"/>
           </w:tcPr>
           <w:p>
             <w:pPr>

</xml_diff>